<commit_message>
feat: add automatic generation and response of certificates with activities and directed to AFP
</commit_message>
<xml_diff>
--- a/resources/templates/certificado_convenio_subsidio_desempleo_template.docx
+++ b/resources/templates/certificado_convenio_subsidio_desempleo_template.docx
@@ -29,7 +29,7 @@
           <w:noProof/>
           <w:lang w:val="es-419" w:eastAsia="es-419"/>
         </w:rPr>
-        <w:pict w14:anchorId="1630A3E4">
+        <w:pict w14:anchorId="6F3DD525">
           <v:shapetype id="_x0000_t201" coordsize="21600,21600" o:spt="201" path="m,l,21600r21600,l21600,xe">
             <v:stroke joinstyle="miter"/>
             <v:path shadowok="f" o:extrusionok="f" strokeok="f" fillok="f" o:connecttype="rect"/>
@@ -970,7 +970,21 @@
           <w:i/>
           <w:iCs/>
         </w:rPr>
-        <w:t xml:space="preserve">La fecha de ingreso puede verificarse en la sección de </w:t>
+        <w:t>La fecha de ingreso</w:t>
+      </w:r>
+      <w:r>
+        <w:rPr>
+          <w:i/>
+          <w:iCs/>
+        </w:rPr>
+        <w:t>/retiro</w:t>
+      </w:r>
+      <w:r>
+        <w:rPr>
+          <w:i/>
+          <w:iCs/>
+        </w:rPr>
+        <w:t xml:space="preserve"> puede verificarse en la sección de </w:t>
       </w:r>
       <w:r>
         <w:rPr>
@@ -12595,7 +12609,7 @@
         <v:path o:extrusionok="f" gradientshapeok="t" o:connecttype="rect"/>
         <o:lock v:ext="edit" aspectratio="t"/>
       </v:shapetype>
-      <v:shape id="Imagen 1302488667" o:spid="_x0000_i1025" type="#_x0000_t75" style="width:11pt;height:11pt;visibility:visible;mso-wrap-style:square" o:bullet="t">
+      <v:shape id="Imagen 1302488667" o:spid="_x0000_i1025" type="#_x0000_t75" style="width:10.9pt;height:10.9pt;visibility:visible;mso-wrap-style:square" o:bullet="t">
         <v:imagedata r:id="rId1" o:title=""/>
       </v:shape>
     </w:pict>

</xml_diff>

<commit_message>
style: remove extra line break in consecutive number
</commit_message>
<xml_diff>
--- a/resources/templates/certificado_convenio_subsidio_desempleo_template.docx
+++ b/resources/templates/certificado_convenio_subsidio_desempleo_template.docx
@@ -17,7 +17,7 @@
           <w:noProof/>
           <w:lang w:val="es-419" w:eastAsia="es-419"/>
         </w:rPr>
-        <w:pict w14:anchorId="4629EBEF">
+        <w:pict w14:anchorId="3102DFB4">
           <v:shapetype id="_x0000_t201" coordsize="21600,21600" o:spt="201" path="m,l,21600r21600,l21600,xe">
             <v:stroke joinstyle="miter"/>
             <v:path shadowok="f" o:extrusionok="f" strokeok="f" fillok="f" o:connecttype="rect"/>
@@ -11989,19 +11989,6 @@
         </w:rPr>
         <w:t>Presidente</w:t>
       </w:r>
-    </w:p>
-    <w:p>
-      <w:pPr>
-        <w:spacing w:after="0" w:line="240" w:lineRule="auto"/>
-        <w:ind w:left="708"/>
-        <w:jc w:val="right"/>
-        <w:rPr>
-          <w:rFonts w:asciiTheme="minorHAnsi" w:hAnsiTheme="minorHAnsi"/>
-          <w:b/>
-          <w:i/>
-          <w:iCs/>
-        </w:rPr>
-      </w:pPr>
     </w:p>
     <w:p>
       <w:pPr>
@@ -12588,7 +12575,7 @@
 <w:numbering xmlns:wpc="http://schemas.microsoft.com/office/word/2010/wordprocessingCanvas" xmlns:cx="http://schemas.microsoft.com/office/drawing/2014/chartex" xmlns:cx1="http://schemas.microsoft.com/office/drawing/2015/9/8/chartex" xmlns:cx2="http://schemas.microsoft.com/office/drawing/2015/10/21/chartex" xmlns:cx3="http://schemas.microsoft.com/office/drawing/2016/5/9/chartex" xmlns:cx4="http://schemas.microsoft.com/office/drawing/2016/5/10/chartex" xmlns:cx5="http://schemas.microsoft.com/office/drawing/2016/5/11/chartex" xmlns:cx6="http://schemas.microsoft.com/office/drawing/2016/5/12/chartex" xmlns:cx7="http://schemas.microsoft.com/office/drawing/2016/5/13/chartex" xmlns:cx8="http://schemas.microsoft.com/office/drawing/2016/5/14/chartex" xmlns:mc="http://schemas.openxmlformats.org/markup-compatibility/2006" xmlns:aink="http://schemas.microsoft.com/office/drawing/2016/ink" xmlns:am3d="http://schemas.microsoft.com/office/drawing/2017/model3d" xmlns:o="urn:schemas-microsoft-com:office:office" xmlns:oel="http://schemas.microsoft.com/office/2019/extlst" xmlns:r="http://schemas.openxmlformats.org/officeDocument/2006/relationships" xmlns:m="http://schemas.openxmlformats.org/officeDocument/2006/math" xmlns:v="urn:schemas-microsoft-com:vml" xmlns:wp14="http://schemas.microsoft.com/office/word/2010/wordprocessingDrawing" xmlns:wp="http://schemas.openxmlformats.org/drawingml/2006/wordprocessingDrawing" xmlns:w10="urn:schemas-microsoft-com:office:word" xmlns:w="http://schemas.openxmlformats.org/wordprocessingml/2006/main" xmlns:w14="http://schemas.microsoft.com/office/word/2010/wordml" xmlns:w15="http://schemas.microsoft.com/office/word/2012/wordml" xmlns:w16cex="http://schemas.microsoft.com/office/word/2018/wordml/cex" xmlns:w16cid="http://schemas.microsoft.com/office/word/2016/wordml/cid" xmlns:w16="http://schemas.microsoft.com/office/word/2018/wordml" xmlns:w16du="http://schemas.microsoft.com/office/word/2023/wordml/word16du" xmlns:w16sdtdh="http://schemas.microsoft.com/office/word/2020/wordml/sdtdatahash" xmlns:w16sdtfl="http://schemas.microsoft.com/office/word/2024/wordml/sdtformatlock" xmlns:w16se="http://schemas.microsoft.com/office/word/2015/wordml/symex" xmlns:wpg="http://schemas.microsoft.com/office/word/2010/wordprocessingGroup" xmlns:wpi="http://schemas.microsoft.com/office/word/2010/wordprocessingInk" xmlns:wne="http://schemas.microsoft.com/office/word/2006/wordml" xmlns:wps="http://schemas.microsoft.com/office/word/2010/wordprocessingShape" mc:Ignorable="w14 w15 w16se w16cid w16 w16cex w16sdtdh w16sdtfl w16du wp14">
   <w:numPicBullet w:numPicBulletId="0">
     <w:pict>
-      <v:shapetype w14:anchorId="4629EBEF" id="_x0000_t75" coordsize="21600,21600" o:spt="75" o:preferrelative="t" path="m@4@5l@4@11@9@11@9@5xe" filled="f" stroked="f">
+      <v:shapetype w14:anchorId="3102DFB4" id="_x0000_t75" coordsize="21600,21600" o:spt="75" o:preferrelative="t" path="m@4@5l@4@11@9@11@9@5xe" filled="f" stroked="f">
         <v:stroke joinstyle="miter"/>
         <v:formulas>
           <v:f eqn="if lineDrawn pixelLineWidth 0"/>

</xml_diff>

<commit_message>
feat: add compensation options, drafted and individual values for the agreement certificate
</commit_message>
<xml_diff>
--- a/resources/templates/certificado_convenio_subsidio_desempleo_template.docx
+++ b/resources/templates/certificado_convenio_subsidio_desempleo_template.docx
@@ -17,21 +17,13 @@
           <w:noProof/>
           <w:lang w:val="es-419" w:eastAsia="es-419"/>
         </w:rPr>
-      </w:r>
-      <w:r>
-        <w:rPr>
-          <w:i/>
-          <w:iCs/>
-          <w:noProof/>
-          <w:lang w:val="es-419" w:eastAsia="es-419"/>
-        </w:rPr>
-        <w:pict w14:anchorId="171BE363">
+        <w:pict w14:anchorId="0802CE8F">
           <v:shapetype id="_x0000_t201" coordsize="21600,21600" o:spt="201" path="m,l,21600r21600,l21600,xe">
             <v:stroke joinstyle="miter"/>
             <v:path shadowok="f" o:extrusionok="f" strokeok="f" fillok="f" o:connecttype="rect"/>
             <o:lock v:ext="edit" shapetype="t"/>
           </v:shapetype>
-          <v:shape id="_x0000_s1028" type="#_x0000_t201" alt="" style="position:absolute;margin-left:537.85pt;margin-top:34.8pt;width:83.25pt;height:36.75pt;z-index:251660288;mso-wrap-edited:f;mso-width-percent:0;mso-height-percent:0;mso-width-percent:0;mso-height-percent:0" o:preferrelative="t" filled="f" stroked="f">
+          <v:shape id="_x0000_s2050" type="#_x0000_t201" alt="" style="position:absolute;margin-left:537.85pt;margin-top:34.8pt;width:83.25pt;height:36.75pt;z-index:251660288;mso-wrap-edited:f;mso-width-percent:0;mso-height-percent:0;mso-width-percent:0;mso-height-percent:0" o:preferrelative="t" filled="f" stroked="f">
             <v:imagedata r:id="rId8" o:title=""/>
             <o:lock v:ext="edit" aspectratio="t"/>
           </v:shape>
@@ -11922,19 +11914,6 @@
           </wp:anchor>
         </w:drawing>
       </w:r>
-    </w:p>
-    <w:p>
-      <w:pPr>
-        <w:pStyle w:val="Sinespaciado"/>
-        <w:ind w:left="709"/>
-        <w:jc w:val="both"/>
-        <w:rPr>
-          <w:rFonts w:asciiTheme="minorHAnsi" w:hAnsiTheme="minorHAnsi"/>
-          <w:b/>
-          <w:i/>
-          <w:iCs/>
-        </w:rPr>
-      </w:pPr>
     </w:p>
     <w:p>
       <w:pPr>
@@ -12572,7 +12551,7 @@
 <w:numbering xmlns:wpc="http://schemas.microsoft.com/office/word/2010/wordprocessingCanvas" xmlns:cx="http://schemas.microsoft.com/office/drawing/2014/chartex" xmlns:cx1="http://schemas.microsoft.com/office/drawing/2015/9/8/chartex" xmlns:cx2="http://schemas.microsoft.com/office/drawing/2015/10/21/chartex" xmlns:cx3="http://schemas.microsoft.com/office/drawing/2016/5/9/chartex" xmlns:cx4="http://schemas.microsoft.com/office/drawing/2016/5/10/chartex" xmlns:cx5="http://schemas.microsoft.com/office/drawing/2016/5/11/chartex" xmlns:cx6="http://schemas.microsoft.com/office/drawing/2016/5/12/chartex" xmlns:cx7="http://schemas.microsoft.com/office/drawing/2016/5/13/chartex" xmlns:cx8="http://schemas.microsoft.com/office/drawing/2016/5/14/chartex" xmlns:mc="http://schemas.openxmlformats.org/markup-compatibility/2006" xmlns:aink="http://schemas.microsoft.com/office/drawing/2016/ink" xmlns:am3d="http://schemas.microsoft.com/office/drawing/2017/model3d" xmlns:o="urn:schemas-microsoft-com:office:office" xmlns:oel="http://schemas.microsoft.com/office/2019/extlst" xmlns:r="http://schemas.openxmlformats.org/officeDocument/2006/relationships" xmlns:m="http://schemas.openxmlformats.org/officeDocument/2006/math" xmlns:v="urn:schemas-microsoft-com:vml" xmlns:wp14="http://schemas.microsoft.com/office/word/2010/wordprocessingDrawing" xmlns:wp="http://schemas.openxmlformats.org/drawingml/2006/wordprocessingDrawing" xmlns:w10="urn:schemas-microsoft-com:office:word" xmlns:w="http://schemas.openxmlformats.org/wordprocessingml/2006/main" xmlns:w14="http://schemas.microsoft.com/office/word/2010/wordml" xmlns:w15="http://schemas.microsoft.com/office/word/2012/wordml" xmlns:w16cex="http://schemas.microsoft.com/office/word/2018/wordml/cex" xmlns:w16cid="http://schemas.microsoft.com/office/word/2016/wordml/cid" xmlns:w16="http://schemas.microsoft.com/office/word/2018/wordml" xmlns:w16du="http://schemas.microsoft.com/office/word/2023/wordml/word16du" xmlns:w16sdtdh="http://schemas.microsoft.com/office/word/2020/wordml/sdtdatahash" xmlns:w16sdtfl="http://schemas.microsoft.com/office/word/2024/wordml/sdtformatlock" xmlns:w16se="http://schemas.microsoft.com/office/word/2015/wordml/symex" xmlns:wpg="http://schemas.microsoft.com/office/word/2010/wordprocessingGroup" xmlns:wpi="http://schemas.microsoft.com/office/word/2010/wordprocessingInk" xmlns:wne="http://schemas.microsoft.com/office/word/2006/wordml" xmlns:wps="http://schemas.microsoft.com/office/word/2010/wordprocessingShape" mc:Ignorable="w14 w15 w16se w16cid w16 w16cex w16sdtdh w16sdtfl w16du wp14">
   <w:numPicBullet w:numPicBulletId="0">
     <w:pict>
-      <v:shapetype w14:anchorId="171BE363" id="_x0000_t75" coordsize="21600,21600" o:spt="75" o:preferrelative="t" path="m@4@5l@4@11@9@11@9@5xe" filled="f" stroked="f">
+      <v:shapetype w14:anchorId="0802CE8F" id="_x0000_t75" coordsize="21600,21600" o:spt="75" o:preferrelative="t" path="m@4@5l@4@11@9@11@9@5xe" filled="f" stroked="f">
         <v:stroke joinstyle="miter"/>
         <v:formulas>
           <v:f eqn="if lineDrawn pixelLineWidth 0"/>

</xml_diff>